<commit_message>
Update documentation - app/services/research_service.py, app/services/ingestion_service.py, app/api/routes/research.py, app/api/routes/ingest.py, app/schemas/api.py, app/schemas/evaluation.py, app/observability/langsmith.py, app/observability/logging.py, app/utils/s3_client.py, app/main.py
</commit_message>
<xml_diff>
--- a/docs/doc.docx
+++ b/docs/doc.docx
@@ -1291,6 +1291,207 @@
       </w:r>
       <w:r>
         <w:t>.</w:t>
+      </w:r>
+    </w:p>
+    <w:p>
+      <w:pPr>
+        <w:pStyle w:val="Heading2"/>
+      </w:pPr>
+      <w:r>
+        <w:lastRenderedPageBreak/>
+        <w:t>app/services/research_service.py</w:t>
+      </w:r>
+      <w:r>
+        <w:t xml:space="preserve">, </w:t>
+      </w:r>
+      <w:r>
+        <w:t>app/services/ingestion_service.py</w:t>
+      </w:r>
+      <w:r>
+        <w:t xml:space="preserve">, </w:t>
+      </w:r>
+      <w:r>
+        <w:t>app/api/routes/research.py</w:t>
+      </w:r>
+      <w:r>
+        <w:t xml:space="preserve">, </w:t>
+      </w:r>
+      <w:r>
+        <w:t>app/api/routes/ingest.py</w:t>
+      </w:r>
+      <w:r>
+        <w:t xml:space="preserve">, </w:t>
+      </w:r>
+      <w:r>
+        <w:t>app/schemas/api.py</w:t>
+      </w:r>
+      <w:r>
+        <w:t xml:space="preserve">, </w:t>
+      </w:r>
+      <w:r>
+        <w:t>app/schemas/evaluation.py</w:t>
+      </w:r>
+      <w:r>
+        <w:t xml:space="preserve">, </w:t>
+      </w:r>
+      <w:r>
+        <w:t>app/observability/langsmith.py</w:t>
+      </w:r>
+      <w:r>
+        <w:t xml:space="preserve">, </w:t>
+      </w:r>
+      <w:r>
+        <w:t>app/observability/logging.py</w:t>
+      </w:r>
+      <w:r>
+        <w:t xml:space="preserve">, </w:t>
+      </w:r>
+      <w:r>
+        <w:t>app/utils/s3_client.py</w:t>
+      </w:r>
+      <w:r>
+        <w:t xml:space="preserve">, </w:t>
+      </w:r>
+      <w:r>
+        <w:t>app/main.py</w:t>
+      </w:r>
+    </w:p>
+    <w:p>
+      <w:r>
+        <w:t xml:space="preserve">MLflow logging is wrapped in a try/except in the service. A logging failure must never break the API response. The report is already generated </w:t>
+      </w:r>
+      <w:r>
+        <w:t>at that point and</w:t>
+      </w:r>
+      <w:r>
+        <w:t xml:space="preserve"> losing the MLflow trace is unfortunate but not a user-facing error. The same principle applies to any observability side-effect: never let instrumentation take down the happy path.</w:t>
+      </w:r>
+    </w:p>
+    <w:p>
+      <w:r>
+        <w:rPr>
+          <w:rStyle w:val="ObjectChar"/>
+        </w:rPr>
+        <w:t>PROMPT_VERSIONS</w:t>
+      </w:r>
+      <w:r>
+        <w:t xml:space="preserve"> is a manual dict in the service layer. Every time you change a prompt file, you bump the version string here. MLflow logs it as a param on every run, so your experiment table shows exactly which prompt version produced which scores. This is the lowest-friction prompt versioning system that actually works in practice.</w:t>
+      </w:r>
+    </w:p>
+    <w:p>
+      <w:r>
+        <w:t xml:space="preserve">Routes are genuinely thin. Each route function is under 10 lines </w:t>
+      </w:r>
+      <w:r>
+        <w:t>and they</w:t>
+      </w:r>
+      <w:r>
+        <w:t xml:space="preserve"> validate input, call the service, return the response. All business logic lives in the service layer. This means you can swap FastAPI for a different framework later, or add a CLI entrypoint, without touching any graph or evaluation code.</w:t>
+      </w:r>
+    </w:p>
+    <w:p>
+      <w:r>
+        <w:rPr>
+          <w:rStyle w:val="ObjectChar"/>
+        </w:rPr>
+        <w:t>get_langsmith_config</w:t>
+      </w:r>
+      <w:r>
+        <w:t xml:space="preserve"> returns a plain dict. LangGraph's </w:t>
+      </w:r>
+      <w:r>
+        <w:rPr>
+          <w:rStyle w:val="ObjectChar"/>
+        </w:rPr>
+        <w:t>invoke</w:t>
+      </w:r>
+      <w:r>
+        <w:t xml:space="preserve"> accepts a </w:t>
+      </w:r>
+      <w:r>
+        <w:rPr>
+          <w:rStyle w:val="ObjectChar"/>
+        </w:rPr>
+        <w:t>config</w:t>
+      </w:r>
+      <w:r>
+        <w:t xml:space="preserve"> dict natively. LangSmith picks up tracing automatically from environment variables (</w:t>
+      </w:r>
+      <w:r>
+        <w:rPr>
+          <w:rStyle w:val="ObjectChar"/>
+        </w:rPr>
+        <w:t>LANGCHAIN_TRACING_V2</w:t>
+      </w:r>
+      <w:r>
+        <w:t xml:space="preserve">, </w:t>
+      </w:r>
+      <w:r>
+        <w:rPr>
+          <w:rStyle w:val="ObjectChar"/>
+        </w:rPr>
+        <w:t>LANGCHAIN_API_KEY</w:t>
+      </w:r>
+      <w:r>
+        <w:t xml:space="preserve">) </w:t>
+      </w:r>
+      <w:r>
+        <w:t>and</w:t>
+      </w:r>
+      <w:r>
+        <w:t xml:space="preserve"> the config dict just adds metadata like run name and tags that make traces readable in the LangSmith UI.</w:t>
+      </w:r>
+    </w:p>
+    <w:p>
+      <w:r>
+        <w:rPr>
+          <w:rStyle w:val="ObjectChar"/>
+        </w:rPr>
+        <w:t>JSONFormatter</w:t>
+      </w:r>
+      <w:r>
+        <w:t xml:space="preserve"> in </w:t>
+      </w:r>
+      <w:r>
+        <w:rPr>
+          <w:rStyle w:val="ObjectChar"/>
+        </w:rPr>
+        <w:t>logging.py</w:t>
+      </w:r>
+      <w:r>
+        <w:t xml:space="preserve"> produces structured logs that CloudWatch Logs parses automatically. In the AWS console you can query </w:t>
+      </w:r>
+      <w:r>
+        <w:rPr>
+          <w:rStyle w:val="ObjectChar"/>
+        </w:rPr>
+        <w:t xml:space="preserve">fields @timestamp, level, message | filter level = "ERROR" </w:t>
+      </w:r>
+      <w:r>
+        <w:t>across all container logs without any extra log parsing configuration.</w:t>
+      </w:r>
+    </w:p>
+    <w:p>
+      <w:r>
+        <w:rPr>
+          <w:rStyle w:val="ObjectChar"/>
+        </w:rPr>
+        <w:t>initial_state</w:t>
+      </w:r>
+      <w:r>
+        <w:t xml:space="preserve"> is fully </w:t>
+      </w:r>
+      <w:r>
+        <w:t>initialized</w:t>
+      </w:r>
+      <w:r>
+        <w:t xml:space="preserve"> in the service, not in the graph. Every field has a value before the graph starts. This means no node ever needs to handle a missing key </w:t>
+      </w:r>
+      <w:r>
+        <w:t>because</w:t>
+      </w:r>
+      <w:r>
+        <w:t xml:space="preserve"> the state contract is always complete from the first node onwards.</w:t>
       </w:r>
     </w:p>
     <w:sectPr>
@@ -6625,7 +6826,6 @@
   <w:style w:type="character" w:default="1" w:styleId="DefaultParagraphFont">
     <w:name w:val="Default Paragraph Font"/>
     <w:uiPriority w:val="1"/>
-    <w:semiHidden/>
     <w:unhideWhenUsed/>
   </w:style>
   <w:style w:type="table" w:default="1" w:styleId="TableNormal">

</xml_diff>

<commit_message>
Update documentation - wrote about app/output/formatter.py, app/schemas/report.py and app/output/pdf_renderer.py
</commit_message>
<xml_diff>
--- a/docs/doc.docx
+++ b/docs/doc.docx
@@ -761,7 +761,15 @@
         <w:t>chunk_overlap=64</w:t>
       </w:r>
       <w:r>
-        <w:t xml:space="preserve"> is a conservative starting point for research documents. 512 tokens gives enough context per chunk for the writer to use it meaningfully. 64 token overlap prevents information loss at chunk boundaries. You'll likely want to experiment with these values in your eval batch runs and log the results to MLflow.</w:t>
+        <w:t xml:space="preserve"> is a conservative starting point for research documents. 512 tokens gives enough context per chunk for the writer to </w:t>
+      </w:r>
+      <w:proofErr w:type="gramStart"/>
+      <w:r>
+        <w:t>use it</w:t>
+      </w:r>
+      <w:proofErr w:type="gramEnd"/>
+      <w:r>
+        <w:t xml:space="preserve"> meaningfully. 64 token overlap prevents information loss at chunk boundaries. You'll likely want to experiment with these values in your eval batch runs and log the results to MLflow.</w:t>
       </w:r>
     </w:p>
     <w:p>
@@ -1492,6 +1500,183 @@
       </w:r>
       <w:r>
         <w:t xml:space="preserve"> the state contract is always complete from the first node onwards.</w:t>
+      </w:r>
+    </w:p>
+    <w:p>
+      <w:pPr>
+        <w:pStyle w:val="Heading2"/>
+      </w:pPr>
+      <w:r>
+        <w:t>app/output/formatter.py</w:t>
+      </w:r>
+      <w:r>
+        <w:t xml:space="preserve">, </w:t>
+      </w:r>
+      <w:r>
+        <w:t>app/schemas/report.py</w:t>
+      </w:r>
+      <w:r>
+        <w:t xml:space="preserve">, </w:t>
+      </w:r>
+      <w:r>
+        <w:t>app/output/pdf_renderer.py</w:t>
+      </w:r>
+    </w:p>
+    <w:p>
+      <w:r>
+        <w:rPr>
+          <w:rStyle w:val="ObjectChar"/>
+        </w:rPr>
+        <w:t>_parse_sections</w:t>
+      </w:r>
+      <w:r>
+        <w:t xml:space="preserve"> is a simple line scanner, not a markdown parser. The writer prompt instructs Gemini to use </w:t>
+      </w:r>
+      <w:r>
+        <w:rPr>
+          <w:rStyle w:val="ObjectChar"/>
+        </w:rPr>
+        <w:t>##</w:t>
+      </w:r>
+      <w:r>
+        <w:t xml:space="preserve"> headings consistently. A line scanner is more predictable than a full markdown parser </w:t>
+      </w:r>
+      <w:r>
+        <w:t>as</w:t>
+      </w:r>
+      <w:r>
+        <w:t xml:space="preserve"> it handles the exact output format you specified in the prompt, and fails loudly (empty sections list) if the format is violated, which you can detect in evaluation.</w:t>
+      </w:r>
+    </w:p>
+    <w:p>
+      <w:r>
+        <w:rPr>
+          <w:rStyle w:val="ObjectChar"/>
+        </w:rPr>
+        <w:t>_extract_executive_summary</w:t>
+      </w:r>
+      <w:r>
+        <w:t xml:space="preserve"> has a keyword fallback. It first looks for a heading containing "executive summary", "summary", or "conclusion". If none exists, it returns the last paragraph. This means the formatter is robust to minor heading variation from the writer without requiring an exact string match.</w:t>
+      </w:r>
+    </w:p>
+    <w:p>
+      <w:r>
+        <w:lastRenderedPageBreak/>
+        <w:t>Citations are deduplicated by source, keeping the highest score. The same source document may contribute multiple chunks across different sub-questions. The citation list shows each source once, with its highest relevance score, sorted by descending score. This gives the reader an immediate sense of which sources drove the report most.</w:t>
+      </w:r>
+    </w:p>
+    <w:p>
+      <w:r>
+        <w:rPr>
+          <w:rStyle w:val="ObjectChar"/>
+        </w:rPr>
+        <w:t>render_to_bytes</w:t>
+      </w:r>
+      <w:r>
+        <w:t xml:space="preserve"> vs </w:t>
+      </w:r>
+      <w:r>
+        <w:rPr>
+          <w:rStyle w:val="ObjectChar"/>
+        </w:rPr>
+        <w:t>render_to_pdf</w:t>
+      </w:r>
+      <w:r>
+        <w:t xml:space="preserve">. </w:t>
+      </w:r>
+      <w:r>
+        <w:rPr>
+          <w:rStyle w:val="ObjectChar"/>
+        </w:rPr>
+        <w:t>render_to_pdf</w:t>
+      </w:r>
+      <w:r>
+        <w:t xml:space="preserve"> writes to disk </w:t>
+      </w:r>
+      <w:r>
+        <w:t>and</w:t>
+      </w:r>
+      <w:r>
+        <w:t xml:space="preserve"> used by </w:t>
+      </w:r>
+      <w:r>
+        <w:rPr>
+          <w:rStyle w:val="ObjectChar"/>
+        </w:rPr>
+        <w:t>scripts/run_eval_batch.py</w:t>
+      </w:r>
+      <w:r>
+        <w:t xml:space="preserve"> where you want to save reports locally for review. </w:t>
+      </w:r>
+      <w:r>
+        <w:rPr>
+          <w:rStyle w:val="ObjectChar"/>
+        </w:rPr>
+        <w:t>render_to_bytes</w:t>
+      </w:r>
+      <w:r>
+        <w:t xml:space="preserve"> returns raw bytes </w:t>
+      </w:r>
+      <w:r>
+        <w:t>and</w:t>
+      </w:r>
+      <w:r>
+        <w:t xml:space="preserve"> used when returning PDF directly from a FastAPI endpoint as a </w:t>
+      </w:r>
+      <w:r>
+        <w:rPr>
+          <w:rStyle w:val="ObjectChar"/>
+        </w:rPr>
+        <w:t>StreamingResponse</w:t>
+      </w:r>
+      <w:r>
+        <w:t xml:space="preserve"> without touching disk. Both use the same </w:t>
+      </w:r>
+      <w:r>
+        <w:rPr>
+          <w:rStyle w:val="ObjectChar"/>
+        </w:rPr>
+        <w:t>_build_html</w:t>
+      </w:r>
+      <w:r>
+        <w:t xml:space="preserve"> internally.</w:t>
+      </w:r>
+    </w:p>
+    <w:p>
+      <w:r>
+        <w:t xml:space="preserve">The eval block appears in the PDF. Every generated PDF includes a dimension score table at the bottom showing the critic's assessment. This is a deliberate design choice </w:t>
+      </w:r>
+      <w:r>
+        <w:t>as</w:t>
+      </w:r>
+      <w:r>
+        <w:t xml:space="preserve"> it makes the system's self-evaluation transparent, which is impressive in a demo and genuinely useful when reviewing output quality during development.</w:t>
+      </w:r>
+    </w:p>
+    <w:p>
+      <w:r>
+        <w:t xml:space="preserve">WeasyPrint renders from an HTML string, not a file. This means no temp files for the HTML intermediate </w:t>
+      </w:r>
+      <w:r>
+        <w:t>as</w:t>
+      </w:r>
+      <w:r>
+        <w:t xml:space="preserve"> </w:t>
+      </w:r>
+      <w:r>
+        <w:t>it</w:t>
+      </w:r>
+      <w:r>
+        <w:t xml:space="preserve"> build the string in memory and pass it directly. The only disk write is the final PDF, and only in the </w:t>
+      </w:r>
+      <w:r>
+        <w:rPr>
+          <w:rStyle w:val="ObjectChar"/>
+        </w:rPr>
+        <w:t>render_to_pdf</w:t>
+      </w:r>
+      <w:r>
+        <w:t xml:space="preserve"> path.</w:t>
       </w:r>
     </w:p>
     <w:sectPr>
@@ -6826,6 +7011,7 @@
   <w:style w:type="character" w:default="1" w:styleId="DefaultParagraphFont">
     <w:name w:val="Default Paragraph Font"/>
     <w:uiPriority w:val="1"/>
+    <w:semiHidden/>
     <w:unhideWhenUsed/>
   </w:style>
   <w:style w:type="table" w:default="1" w:styleId="TableNormal">

</xml_diff>

<commit_message>
Update documentation  - add scripts/ingest_sample_docs.py and scripts/run_eval_batch.py section
</commit_message>
<xml_diff>
--- a/docs/doc.docx
+++ b/docs/doc.docx
@@ -1677,6 +1677,218 @@
       </w:r>
       <w:r>
         <w:t xml:space="preserve"> path.</w:t>
+      </w:r>
+    </w:p>
+    <w:p>
+      <w:pPr>
+        <w:pStyle w:val="Heading2"/>
+      </w:pPr>
+      <w:r>
+        <w:t>scripts/ingest_sample_docs.py</w:t>
+      </w:r>
+      <w:r>
+        <w:t xml:space="preserve">, </w:t>
+      </w:r>
+      <w:r>
+        <w:t>scripts/run_eval_batch.py</w:t>
+      </w:r>
+    </w:p>
+    <w:p>
+      <w:r>
+        <w:rPr>
+          <w:rStyle w:val="ObjectChar"/>
+        </w:rPr>
+        <w:t>sys.path.insert(0, ...)</w:t>
+      </w:r>
+      <w:r>
+        <w:t xml:space="preserve"> at the top of both scripts adds the project root to Python's module search path. Without this, running </w:t>
+      </w:r>
+      <w:r>
+        <w:rPr>
+          <w:rStyle w:val="ObjectChar"/>
+        </w:rPr>
+        <w:t>python scripts/run_eval_batch.py</w:t>
+      </w:r>
+      <w:r>
+        <w:t xml:space="preserve"> from the project root would fail to resolve </w:t>
+      </w:r>
+      <w:r>
+        <w:rPr>
+          <w:rStyle w:val="ObjectChar"/>
+        </w:rPr>
+        <w:t>from app.services...</w:t>
+      </w:r>
+      <w:r>
+        <w:t xml:space="preserve"> because Python doesn't automatically treat the parent directory as a package root. This is the standard fix for scripts that live outside the main package.</w:t>
+      </w:r>
+    </w:p>
+    <w:p>
+      <w:r>
+        <w:rPr>
+          <w:rStyle w:val="ObjectChar"/>
+        </w:rPr>
+        <w:t>ingest_sample_docs.py</w:t>
+      </w:r>
+      <w:r>
+        <w:t xml:space="preserve"> accepts both </w:t>
+      </w:r>
+      <w:r>
+        <w:rPr>
+          <w:rStyle w:val="ObjectChar"/>
+        </w:rPr>
+        <w:t>--file</w:t>
+      </w:r>
+      <w:r>
+        <w:t xml:space="preserve"> and </w:t>
+      </w:r>
+      <w:r>
+        <w:rPr>
+          <w:rStyle w:val="ObjectChar"/>
+        </w:rPr>
+        <w:t>--dir</w:t>
+      </w:r>
+      <w:r>
+        <w:t xml:space="preserve"> as mutually exclusive arguments. The directory path walks all supported extensions and ingests them in sorted </w:t>
+      </w:r>
+      <w:r>
+        <w:t>order. Ingestion</w:t>
+      </w:r>
+      <w:r>
+        <w:t xml:space="preserve"> is deterministic and reproducible across runs. File type filtering happens in </w:t>
+      </w:r>
+      <w:r>
+        <w:rPr>
+          <w:rStyle w:val="ObjectChar"/>
+        </w:rPr>
+        <w:t>ingest_directory</w:t>
+      </w:r>
+      <w:r>
+        <w:t xml:space="preserve"> when building the file list, and in </w:t>
+      </w:r>
+      <w:r>
+        <w:rPr>
+          <w:rStyle w:val="ObjectChar"/>
+        </w:rPr>
+        <w:t>ingest_file</w:t>
+      </w:r>
+      <w:r>
+        <w:t xml:space="preserve"> as a safety guard for direct file calls.</w:t>
+      </w:r>
+    </w:p>
+    <w:p>
+      <w:r>
+        <w:rPr>
+          <w:rStyle w:val="ObjectChar"/>
+        </w:rPr>
+        <w:t>run_eval_batch.py</w:t>
+      </w:r>
+      <w:r>
+        <w:t xml:space="preserve"> catches exceptions per query and continues. A single failed query </w:t>
+      </w:r>
+      <w:r>
+        <w:t>with</w:t>
+      </w:r>
+      <w:r>
+        <w:t xml:space="preserve"> network timeout, Pinecone error, malformed LLM output should not abort the entire batch. The error is recorded in the result dict with </w:t>
+      </w:r>
+      <w:r>
+        <w:rPr>
+          <w:rStyle w:val="ObjectChar"/>
+        </w:rPr>
+        <w:t>"error": str(e)</w:t>
+      </w:r>
+      <w:r>
+        <w:t xml:space="preserve"> and flagged as </w:t>
+      </w:r>
+      <w:r>
+        <w:rPr>
+          <w:rStyle w:val="ObjectChar"/>
+        </w:rPr>
+        <w:t>[ERROR]</w:t>
+      </w:r>
+      <w:r>
+        <w:t xml:space="preserve"> in the summary table. This means you always get a complete results file even if some queries fail.</w:t>
+      </w:r>
+    </w:p>
+    <w:p>
+      <w:r>
+        <w:t xml:space="preserve">The summary table includes a dimension bar chart. The </w:t>
+      </w:r>
+      <w:r>
+        <w:rPr>
+          <w:rStyle w:val="ObjectChar"/>
+          <w:rFonts w:ascii="Arial" w:hAnsi="Arial" w:cs="Arial"/>
+        </w:rPr>
+        <w:t>█</w:t>
+      </w:r>
+      <w:r>
+        <w:t xml:space="preserve"> and </w:t>
+      </w:r>
+      <w:r>
+        <w:rPr>
+          <w:rStyle w:val="ObjectChar"/>
+          <w:rFonts w:ascii="Arial" w:hAnsi="Arial" w:cs="Arial"/>
+        </w:rPr>
+        <w:t>░</w:t>
+      </w:r>
+      <w:r>
+        <w:t xml:space="preserve"> characters render a 5-bar horizontal chart for each dimension's average score directly in the terminal. This gives you an immediate visual read on which dimensions are systematically weak across all queries </w:t>
+      </w:r>
+      <w:r>
+        <w:t>that</w:t>
+      </w:r>
+      <w:r>
+        <w:t xml:space="preserve"> signal you need to decide which prompt to iterate on next.</w:t>
+      </w:r>
+    </w:p>
+    <w:p>
+      <w:r>
+        <w:t xml:space="preserve">Results are saved to JSON alongside being printed. </w:t>
+      </w:r>
+      <w:r>
+        <w:rPr>
+          <w:rStyle w:val="ObjectChar"/>
+        </w:rPr>
+        <w:t>eval_results.json</w:t>
+      </w:r>
+      <w:r>
+        <w:t xml:space="preserve"> gives you a machine-readable record of every batch run. You can diff two result files across prompt versions, feed them into a notebook for deeper analysis, or archive them alongside your MLflow runs. Each MLflow run also has the full report as an artifact</w:t>
+      </w:r>
+      <w:r>
+        <w:t>.</w:t>
+      </w:r>
+      <w:r>
+        <w:t xml:space="preserve"> </w:t>
+      </w:r>
+      <w:r>
+        <w:t>T</w:t>
+      </w:r>
+      <w:r>
+        <w:t xml:space="preserve">he JSON gives you the scores in a </w:t>
+      </w:r>
+      <w:r>
+        <w:t>format that is</w:t>
+      </w:r>
+      <w:r>
+        <w:t xml:space="preserve"> easier to process programmatically.</w:t>
+      </w:r>
+    </w:p>
+    <w:p>
+      <w:r>
+        <w:rPr>
+          <w:rStyle w:val="ObjectChar"/>
+        </w:rPr>
+        <w:lastRenderedPageBreak/>
+        <w:t>DEFAULT_QUERIES</w:t>
+      </w:r>
+      <w:r>
+        <w:t xml:space="preserve"> are domain-agnostic ML/AI topics. These are chosen to be answerable from publicly available research papers and documentation</w:t>
+      </w:r>
+      <w:r>
+        <w:t xml:space="preserve"> as they are</w:t>
+      </w:r>
+      <w:r>
+        <w:t xml:space="preserve"> the kind of content you'd seed into Pinecone during development. Replace or extend them with domain-specific queries once you have a real corpus ingested.</w:t>
       </w:r>
     </w:p>
     <w:sectPr>
@@ -7011,7 +7223,6 @@
   <w:style w:type="character" w:default="1" w:styleId="DefaultParagraphFont">
     <w:name w:val="Default Paragraph Font"/>
     <w:uiPriority w:val="1"/>
-    <w:semiHidden/>
     <w:unhideWhenUsed/>
   </w:style>
   <w:style w:type="table" w:default="1" w:styleId="TableNormal">

</xml_diff>